<commit_message>
docs: documento tecnico final con figuras y tablas verificadas
</commit_message>
<xml_diff>
--- a/Rios_JuanCamilo_Montecarlo.docx
+++ b/Rios_JuanCamilo_Montecarlo.docx
@@ -197,6 +197,7 @@
     </w:p>
     <w:p>
       <w:pPr>
+        <w:spacing w:after="40" w:line="240" w:lineRule="auto"/>
         <w:jc w:val="left"/>
       </w:pPr>
       <w:r>
@@ -209,6 +210,7 @@
     </w:p>
     <w:p>
       <w:pPr>
+        <w:spacing w:after="40" w:line="240" w:lineRule="auto"/>
         <w:jc w:val="left"/>
       </w:pPr>
       <w:r>
@@ -221,6 +223,7 @@
     </w:p>
     <w:p>
       <w:pPr>
+        <w:spacing w:after="40" w:line="240" w:lineRule="auto"/>
         <w:jc w:val="left"/>
       </w:pPr>
       <w:r>
@@ -233,6 +236,7 @@
     </w:p>
     <w:p>
       <w:pPr>
+        <w:spacing w:after="40" w:line="240" w:lineRule="auto"/>
         <w:jc w:val="left"/>
       </w:pPr>
       <w:r>
@@ -245,6 +249,7 @@
     </w:p>
     <w:p>
       <w:pPr>
+        <w:spacing w:after="40" w:line="240" w:lineRule="auto"/>
         <w:jc w:val="left"/>
       </w:pPr>
       <w:r>
@@ -257,6 +262,7 @@
     </w:p>
     <w:p>
       <w:pPr>
+        <w:spacing w:after="40" w:line="240" w:lineRule="auto"/>
         <w:jc w:val="left"/>
       </w:pPr>
       <w:r>
@@ -269,6 +275,7 @@
     </w:p>
     <w:p>
       <w:pPr>
+        <w:spacing w:after="40" w:line="240" w:lineRule="auto"/>
         <w:jc w:val="left"/>
       </w:pPr>
       <w:r>
@@ -281,6 +288,7 @@
     </w:p>
     <w:p>
       <w:pPr>
+        <w:spacing w:after="40" w:line="240" w:lineRule="auto"/>
         <w:jc w:val="left"/>
       </w:pPr>
       <w:r>
@@ -293,6 +301,7 @@
     </w:p>
     <w:p>
       <w:pPr>
+        <w:spacing w:after="40" w:line="240" w:lineRule="auto"/>
         <w:jc w:val="left"/>
       </w:pPr>
       <w:r>
@@ -3027,33 +3036,89 @@
     </w:p>
     <w:p>
       <w:pPr>
+        <w:keepLines/>
         <w:spacing w:before="120" w:after="160" w:line="240" w:lineRule="auto"/>
-        <w:ind w:left="340"/>
+        <w:ind w:left="283" w:right="170"/>
+        <w:jc w:val="left"/>
         <w:shd w:fill="F2F2F2"/>
       </w:pPr>
       <w:r>
         <w:rPr>
-          <w:rFonts w:ascii="Consolas" w:hAnsi="Consolas" w:eastAsia="Consolas"/>
-          <w:sz w:val="17"/>
+          <w:rFonts w:ascii="Courier New" w:hAnsi="Courier New" w:eastAsia="Courier New" w:cs="Courier New"/>
+          <w:sz w:val="16"/>
         </w:rPr>
         <w:t>main.py  (interfaz de usuario)</w:t>
         <w:br/>
+      </w:r>
+      <w:r>
+        <w:rPr>
+          <w:rFonts w:ascii="Courier New" w:hAnsi="Courier New" w:eastAsia="Courier New" w:cs="Courier New"/>
+          <w:sz w:val="16"/>
+        </w:rPr>
         <w:t xml:space="preserve">   │</w:t>
         <w:br/>
+      </w:r>
+      <w:r>
+        <w:rPr>
+          <w:rFonts w:ascii="Courier New" w:hAnsi="Courier New" w:eastAsia="Courier New" w:cs="Courier New"/>
+          <w:sz w:val="16"/>
+        </w:rPr>
         <w:t xml:space="preserve">   ├── juego.py ──► estrategias.py ──► tabla.py ──► puntuacion.py ──► dados.py</w:t>
         <w:br/>
+      </w:r>
+      <w:r>
+        <w:rPr>
+          <w:rFonts w:ascii="Courier New" w:hAnsi="Courier New" w:eastAsia="Courier New" w:cs="Courier New"/>
+          <w:sz w:val="16"/>
+        </w:rPr>
         <w:t xml:space="preserve">   │        (turnos)     (decisiones)     (estado)      (reglas)        (azar)</w:t>
         <w:br/>
+      </w:r>
+      <w:r>
+        <w:rPr>
+          <w:rFonts w:ascii="Courier New" w:hAnsi="Courier New" w:eastAsia="Courier New" w:cs="Courier New"/>
+          <w:sz w:val="16"/>
+        </w:rPr>
         <w:t xml:space="preserve">   │</w:t>
         <w:br/>
+      </w:r>
+      <w:r>
+        <w:rPr>
+          <w:rFonts w:ascii="Courier New" w:hAnsi="Courier New" w:eastAsia="Courier New" w:cs="Courier New"/>
+          <w:sz w:val="16"/>
+        </w:rPr>
         <w:t xml:space="preserve">   └── montecarlo.py ──► juego.py</w:t>
         <w:br/>
+      </w:r>
+      <w:r>
+        <w:rPr>
+          <w:rFonts w:ascii="Courier New" w:hAnsi="Courier New" w:eastAsia="Courier New" w:cs="Courier New"/>
+          <w:sz w:val="16"/>
+        </w:rPr>
         <w:t xml:space="preserve">            │</w:t>
         <w:br/>
+      </w:r>
+      <w:r>
+        <w:rPr>
+          <w:rFonts w:ascii="Courier New" w:hAnsi="Courier New" w:eastAsia="Courier New" w:cs="Courier New"/>
+          <w:sz w:val="16"/>
+        </w:rPr>
         <w:t xml:space="preserve">            └── graficas.py  (figuras PNG)</w:t>
         <w:br/>
+      </w:r>
+      <w:r>
+        <w:rPr>
+          <w:rFonts w:ascii="Courier New" w:hAnsi="Courier New" w:eastAsia="Courier New" w:cs="Courier New"/>
+          <w:sz w:val="16"/>
+        </w:rPr>
         <w:t xml:space="preserve">                     ▲</w:t>
         <w:br/>
+      </w:r>
+      <w:r>
+        <w:rPr>
+          <w:rFonts w:ascii="Courier New" w:hAnsi="Courier New" w:eastAsia="Courier New" w:cs="Courier New"/>
+          <w:sz w:val="16"/>
+        </w:rPr>
         <w:t xml:space="preserve">            resultados/ (CSV + JSON)</w:t>
       </w:r>
     </w:p>
@@ -3099,46 +3164,144 @@
     </w:p>
     <w:p>
       <w:pPr>
+        <w:keepLines/>
         <w:spacing w:before="120" w:after="160" w:line="240" w:lineRule="auto"/>
-        <w:ind w:left="340"/>
+        <w:ind w:left="283" w:right="170"/>
+        <w:jc w:val="left"/>
         <w:shd w:fill="F2F2F2"/>
       </w:pPr>
       <w:r>
         <w:rPr>
-          <w:rFonts w:ascii="Consolas" w:hAnsi="Consolas" w:eastAsia="Consolas"/>
-          <w:sz w:val="17"/>
+          <w:rFonts w:ascii="Courier New" w:hAnsi="Courier New" w:eastAsia="Courier New" w:cs="Courier New"/>
+          <w:sz w:val="16"/>
         </w:rPr>
         <w:t>FUNCIÓN jugar_turno(jugador):</w:t>
         <w:br/>
+      </w:r>
+      <w:r>
+        <w:rPr>
+          <w:rFonts w:ascii="Courier New" w:hAnsi="Courier New" w:eastAsia="Courier New" w:cs="Courier New"/>
+          <w:sz w:val="16"/>
+        </w:rPr>
         <w:t xml:space="preserve">    tirada ← lanzar_dados(5)</w:t>
         <w:br/>
+      </w:r>
+      <w:r>
+        <w:rPr>
+          <w:rFonts w:ascii="Courier New" w:hAnsi="Courier New" w:eastAsia="Courier New" w:cs="Courier New"/>
+          <w:sz w:val="16"/>
+        </w:rPr>
         <w:t xml:space="preserve">    lanzamientos ← 1</w:t>
         <w:br/>
+      </w:r>
+      <w:r>
+        <w:rPr>
+          <w:rFonts w:ascii="Courier New" w:hAnsi="Courier New" w:eastAsia="Courier New" w:cs="Courier New"/>
+          <w:sz w:val="16"/>
+        </w:rPr>
         <w:t xml:space="preserve">    MIENTRAS lanzamientos &lt; 3:</w:t>
         <w:br/>
+      </w:r>
+      <w:r>
+        <w:rPr>
+          <w:rFonts w:ascii="Courier New" w:hAnsi="Courier New" w:eastAsia="Courier New" w:cs="Courier New"/>
+          <w:sz w:val="16"/>
+        </w:rPr>
         <w:t xml:space="preserve">        conservar ← estrategia.elegir_conservar(tirada, 3 - lanzamientos, tabla)</w:t>
         <w:br/>
+      </w:r>
+      <w:r>
+        <w:rPr>
+          <w:rFonts w:ascii="Courier New" w:hAnsi="Courier New" w:eastAsia="Courier New" w:cs="Courier New"/>
+          <w:sz w:val="16"/>
+        </w:rPr>
         <w:t xml:space="preserve">        SI |conservar| = 5: SALIR           # el jugador se planta</w:t>
         <w:br/>
+      </w:r>
+      <w:r>
+        <w:rPr>
+          <w:rFonts w:ascii="Courier New" w:hAnsi="Courier New" w:eastAsia="Courier New" w:cs="Courier New"/>
+          <w:sz w:val="16"/>
+        </w:rPr>
         <w:t xml:space="preserve">        tirada ← conservar + lanzar_dados(5 - |conservar|)</w:t>
         <w:br/>
+      </w:r>
+      <w:r>
+        <w:rPr>
+          <w:rFonts w:ascii="Courier New" w:hAnsi="Courier New" w:eastAsia="Courier New" w:cs="Courier New"/>
+          <w:sz w:val="16"/>
+        </w:rPr>
         <w:t xml:space="preserve">        lanzamientos ← lanzamientos + 1</w:t>
         <w:br/>
+      </w:r>
+      <w:r>
+        <w:rPr>
+          <w:rFonts w:ascii="Courier New" w:hAnsi="Courier New" w:eastAsia="Courier New" w:cs="Courier New"/>
+          <w:sz w:val="16"/>
+        </w:rPr>
         <w:t xml:space="preserve">    casilla ← estrategia.elegir_categoria(tirada, tabla)</w:t>
         <w:br/>
+      </w:r>
+      <w:r>
+        <w:rPr>
+          <w:rFonts w:ascii="Courier New" w:hAnsi="Courier New" w:eastAsia="Courier New" w:cs="Courier New"/>
+          <w:sz w:val="16"/>
+        </w:rPr>
         <w:t xml:space="preserve">    tabla.anotar(casilla, tirada)</w:t>
         <w:br/>
+      </w:r>
+      <w:r>
+        <w:rPr>
+          <w:rFonts w:ascii="Courier New" w:hAnsi="Courier New" w:eastAsia="Courier New" w:cs="Courier New"/>
+          <w:sz w:val="16"/>
+        </w:rPr>
         <w:br/>
+      </w:r>
+      <w:r>
+        <w:rPr>
+          <w:rFonts w:ascii="Courier New" w:hAnsi="Courier New" w:eastAsia="Courier New" w:cs="Courier New"/>
+          <w:sz w:val="16"/>
+        </w:rPr>
         <w:t>FUNCIÓN simular(N, estrategia, semilla):</w:t>
         <w:br/>
+      </w:r>
+      <w:r>
+        <w:rPr>
+          <w:rFonts w:ascii="Courier New" w:hAnsi="Courier New" w:eastAsia="Courier New" w:cs="Courier New"/>
+          <w:sz w:val="16"/>
+        </w:rPr>
         <w:t xml:space="preserve">    rng ← Generador(semilla)</w:t>
         <w:br/>
+      </w:r>
+      <w:r>
+        <w:rPr>
+          <w:rFonts w:ascii="Courier New" w:hAnsi="Courier New" w:eastAsia="Courier New" w:cs="Courier New"/>
+          <w:sz w:val="16"/>
+        </w:rPr>
         <w:t xml:space="preserve">    puntajes ← []</w:t>
         <w:br/>
+      </w:r>
+      <w:r>
+        <w:rPr>
+          <w:rFonts w:ascii="Courier New" w:hAnsi="Courier New" w:eastAsia="Courier New" w:cs="Courier New"/>
+          <w:sz w:val="16"/>
+        </w:rPr>
         <w:t xml:space="preserve">    REPETIR N veces:</w:t>
         <w:br/>
+      </w:r>
+      <w:r>
+        <w:rPr>
+          <w:rFonts w:ascii="Courier New" w:hAnsi="Courier New" w:eastAsia="Courier New" w:cs="Courier New"/>
+          <w:sz w:val="16"/>
+        </w:rPr>
         <w:t xml:space="preserve">        puntajes.agregar(jugar_partida(estrategia, rng).puntaje)</w:t>
         <w:br/>
+      </w:r>
+      <w:r>
+        <w:rPr>
+          <w:rFonts w:ascii="Courier New" w:hAnsi="Courier New" w:eastAsia="Courier New" w:cs="Courier New"/>
+          <w:sz w:val="16"/>
+        </w:rPr>
         <w:t xml:space="preserve">    DEVOLVER puntajes</w:t>
       </w:r>
     </w:p>
@@ -3200,29 +3363,73 @@
     </w:p>
     <w:p>
       <w:pPr>
+        <w:keepLines/>
         <w:spacing w:before="120" w:after="160" w:line="240" w:lineRule="auto"/>
-        <w:ind w:left="340"/>
+        <w:ind w:left="283" w:right="170"/>
+        <w:jc w:val="left"/>
         <w:shd w:fill="F2F2F2"/>
       </w:pPr>
       <w:r>
         <w:rPr>
-          <w:rFonts w:ascii="Consolas" w:hAnsi="Consolas" w:eastAsia="Consolas"/>
-          <w:sz w:val="17"/>
+          <w:rFonts w:ascii="Courier New" w:hAnsi="Courier New" w:eastAsia="Courier New" w:cs="Courier New"/>
+          <w:sz w:val="16"/>
         </w:rPr>
         <w:t>SI hay cinco iguales      → Yahtzee (si está libre)</w:t>
         <w:br/>
+      </w:r>
+      <w:r>
+        <w:rPr>
+          <w:rFonts w:ascii="Courier New" w:hAnsi="Courier New" w:eastAsia="Courier New" w:cs="Courier New"/>
+          <w:sz w:val="16"/>
+        </w:rPr>
         <w:t>SINO SI hay escalera de 5  → Grande y recto</w:t>
         <w:br/>
+      </w:r>
+      <w:r>
+        <w:rPr>
+          <w:rFonts w:ascii="Courier New" w:hAnsi="Courier New" w:eastAsia="Courier New" w:cs="Courier New"/>
+          <w:sz w:val="16"/>
+        </w:rPr>
         <w:t>SINO SI hay escalera de 4  → Pequeño recto</w:t>
         <w:br/>
+      </w:r>
+      <w:r>
+        <w:rPr>
+          <w:rFonts w:ascii="Courier New" w:hAnsi="Courier New" w:eastAsia="Courier New" w:cs="Courier New"/>
+          <w:sz w:val="16"/>
+        </w:rPr>
         <w:t>SINO SI hay casa llena     → Casa llena</w:t>
         <w:br/>
+      </w:r>
+      <w:r>
+        <w:rPr>
+          <w:rFonts w:ascii="Courier New" w:hAnsi="Courier New" w:eastAsia="Courier New" w:cs="Courier New"/>
+          <w:sz w:val="16"/>
+        </w:rPr>
         <w:t>SINO SI hay cuatro iguales → Cuatro de la misma clase</w:t>
         <w:br/>
+      </w:r>
+      <w:r>
+        <w:rPr>
+          <w:rFonts w:ascii="Courier New" w:hAnsi="Courier New" w:eastAsia="Courier New" w:cs="Courier New"/>
+          <w:sz w:val="16"/>
+        </w:rPr>
         <w:t>SINO SI hay tres iguales   → casilla superior de esa cara</w:t>
         <w:br/>
+      </w:r>
+      <w:r>
+        <w:rPr>
+          <w:rFonts w:ascii="Courier New" w:hAnsi="Courier New" w:eastAsia="Courier New" w:cs="Courier New"/>
+          <w:sz w:val="16"/>
+        </w:rPr>
         <w:t>SINO SI hay un par         → casilla superior de la cara más alta</w:t>
         <w:br/>
+      </w:r>
+      <w:r>
+        <w:rPr>
+          <w:rFonts w:ascii="Courier New" w:hAnsi="Courier New" w:eastAsia="Courier New" w:cs="Courier New"/>
+          <w:sz w:val="16"/>
+        </w:rPr>
         <w:t>SINO                       → Oportunidad o la casilla superior más alta</w:t>
       </w:r>
     </w:p>
@@ -4001,7 +4208,7 @@
         </w:tc>
         <w:tc>
           <w:tcPr>
-            <w:tcW w:type="dxa" w:w="850"/>
+            <w:tcW w:type="dxa" w:w="794"/>
             <w:shd w:fill="1F4E79"/>
           </w:tcPr>
           <w:p>
@@ -4021,7 +4228,7 @@
         </w:tc>
         <w:tc>
           <w:tcPr>
-            <w:tcW w:type="dxa" w:w="850"/>
+            <w:tcW w:type="dxa" w:w="794"/>
             <w:shd w:fill="1F4E79"/>
           </w:tcPr>
           <w:p>
@@ -4041,7 +4248,7 @@
         </w:tc>
         <w:tc>
           <w:tcPr>
-            <w:tcW w:type="dxa" w:w="850"/>
+            <w:tcW w:type="dxa" w:w="794"/>
             <w:shd w:fill="1F4E79"/>
           </w:tcPr>
           <w:p>
@@ -4061,7 +4268,7 @@
         </w:tc>
         <w:tc>
           <w:tcPr>
-            <w:tcW w:type="dxa" w:w="850"/>
+            <w:tcW w:type="dxa" w:w="794"/>
             <w:shd w:fill="1F4E79"/>
           </w:tcPr>
           <w:p>
@@ -4081,7 +4288,7 @@
         </w:tc>
         <w:tc>
           <w:tcPr>
-            <w:tcW w:type="dxa" w:w="850"/>
+            <w:tcW w:type="dxa" w:w="794"/>
             <w:shd w:fill="1F4E79"/>
           </w:tcPr>
           <w:p>
@@ -4101,7 +4308,7 @@
         </w:tc>
         <w:tc>
           <w:tcPr>
-            <w:tcW w:type="dxa" w:w="850"/>
+            <w:tcW w:type="dxa" w:w="794"/>
             <w:shd w:fill="1F4E79"/>
           </w:tcPr>
           <w:p>
@@ -4121,7 +4328,7 @@
         </w:tc>
         <w:tc>
           <w:tcPr>
-            <w:tcW w:type="dxa" w:w="1247"/>
+            <w:tcW w:type="dxa" w:w="1417"/>
             <w:shd w:fill="1F4E79"/>
           </w:tcPr>
           <w:p>
@@ -4141,7 +4348,7 @@
         </w:tc>
         <w:tc>
           <w:tcPr>
-            <w:tcW w:type="dxa" w:w="907"/>
+            <w:tcW w:type="dxa" w:w="850"/>
             <w:shd w:fill="1F4E79"/>
           </w:tcPr>
           <w:p>
@@ -4180,7 +4387,7 @@
         </w:tc>
         <w:tc>
           <w:tcPr>
-            <w:tcW w:type="dxa" w:w="850"/>
+            <w:tcW w:type="dxa" w:w="794"/>
           </w:tcPr>
           <w:p>
             <w:pPr>
@@ -4197,7 +4404,7 @@
         </w:tc>
         <w:tc>
           <w:tcPr>
-            <w:tcW w:type="dxa" w:w="850"/>
+            <w:tcW w:type="dxa" w:w="794"/>
           </w:tcPr>
           <w:p>
             <w:pPr>
@@ -4214,7 +4421,7 @@
         </w:tc>
         <w:tc>
           <w:tcPr>
-            <w:tcW w:type="dxa" w:w="850"/>
+            <w:tcW w:type="dxa" w:w="794"/>
           </w:tcPr>
           <w:p>
             <w:pPr>
@@ -4231,7 +4438,7 @@
         </w:tc>
         <w:tc>
           <w:tcPr>
-            <w:tcW w:type="dxa" w:w="850"/>
+            <w:tcW w:type="dxa" w:w="794"/>
           </w:tcPr>
           <w:p>
             <w:pPr>
@@ -4248,7 +4455,7 @@
         </w:tc>
         <w:tc>
           <w:tcPr>
-            <w:tcW w:type="dxa" w:w="850"/>
+            <w:tcW w:type="dxa" w:w="794"/>
           </w:tcPr>
           <w:p>
             <w:pPr>
@@ -4265,7 +4472,7 @@
         </w:tc>
         <w:tc>
           <w:tcPr>
-            <w:tcW w:type="dxa" w:w="850"/>
+            <w:tcW w:type="dxa" w:w="794"/>
           </w:tcPr>
           <w:p>
             <w:pPr>
@@ -4282,7 +4489,7 @@
         </w:tc>
         <w:tc>
           <w:tcPr>
-            <w:tcW w:type="dxa" w:w="1247"/>
+            <w:tcW w:type="dxa" w:w="1417"/>
           </w:tcPr>
           <w:p>
             <w:pPr>
@@ -4299,7 +4506,7 @@
         </w:tc>
         <w:tc>
           <w:tcPr>
-            <w:tcW w:type="dxa" w:w="907"/>
+            <w:tcW w:type="dxa" w:w="850"/>
           </w:tcPr>
           <w:p>
             <w:pPr>
@@ -4336,7 +4543,7 @@
         </w:tc>
         <w:tc>
           <w:tcPr>
-            <w:tcW w:type="dxa" w:w="850"/>
+            <w:tcW w:type="dxa" w:w="794"/>
             <w:shd w:fill="EAF1F8"/>
           </w:tcPr>
           <w:p>
@@ -4354,7 +4561,7 @@
         </w:tc>
         <w:tc>
           <w:tcPr>
-            <w:tcW w:type="dxa" w:w="850"/>
+            <w:tcW w:type="dxa" w:w="794"/>
             <w:shd w:fill="EAF1F8"/>
           </w:tcPr>
           <w:p>
@@ -4372,7 +4579,7 @@
         </w:tc>
         <w:tc>
           <w:tcPr>
-            <w:tcW w:type="dxa" w:w="850"/>
+            <w:tcW w:type="dxa" w:w="794"/>
             <w:shd w:fill="EAF1F8"/>
           </w:tcPr>
           <w:p>
@@ -4390,7 +4597,7 @@
         </w:tc>
         <w:tc>
           <w:tcPr>
-            <w:tcW w:type="dxa" w:w="850"/>
+            <w:tcW w:type="dxa" w:w="794"/>
             <w:shd w:fill="EAF1F8"/>
           </w:tcPr>
           <w:p>
@@ -4408,7 +4615,7 @@
         </w:tc>
         <w:tc>
           <w:tcPr>
-            <w:tcW w:type="dxa" w:w="850"/>
+            <w:tcW w:type="dxa" w:w="794"/>
             <w:shd w:fill="EAF1F8"/>
           </w:tcPr>
           <w:p>
@@ -4426,7 +4633,7 @@
         </w:tc>
         <w:tc>
           <w:tcPr>
-            <w:tcW w:type="dxa" w:w="850"/>
+            <w:tcW w:type="dxa" w:w="794"/>
             <w:shd w:fill="EAF1F8"/>
           </w:tcPr>
           <w:p>
@@ -4444,7 +4651,7 @@
         </w:tc>
         <w:tc>
           <w:tcPr>
-            <w:tcW w:type="dxa" w:w="1247"/>
+            <w:tcW w:type="dxa" w:w="1417"/>
             <w:shd w:fill="EAF1F8"/>
           </w:tcPr>
           <w:p>
@@ -4462,7 +4669,7 @@
         </w:tc>
         <w:tc>
           <w:tcPr>
-            <w:tcW w:type="dxa" w:w="907"/>
+            <w:tcW w:type="dxa" w:w="850"/>
             <w:shd w:fill="EAF1F8"/>
           </w:tcPr>
           <w:p>
@@ -4499,7 +4706,7 @@
         </w:tc>
         <w:tc>
           <w:tcPr>
-            <w:tcW w:type="dxa" w:w="850"/>
+            <w:tcW w:type="dxa" w:w="794"/>
           </w:tcPr>
           <w:p>
             <w:pPr>
@@ -4516,7 +4723,7 @@
         </w:tc>
         <w:tc>
           <w:tcPr>
-            <w:tcW w:type="dxa" w:w="850"/>
+            <w:tcW w:type="dxa" w:w="794"/>
           </w:tcPr>
           <w:p>
             <w:pPr>
@@ -4533,7 +4740,7 @@
         </w:tc>
         <w:tc>
           <w:tcPr>
-            <w:tcW w:type="dxa" w:w="850"/>
+            <w:tcW w:type="dxa" w:w="794"/>
           </w:tcPr>
           <w:p>
             <w:pPr>
@@ -4550,7 +4757,7 @@
         </w:tc>
         <w:tc>
           <w:tcPr>
-            <w:tcW w:type="dxa" w:w="850"/>
+            <w:tcW w:type="dxa" w:w="794"/>
           </w:tcPr>
           <w:p>
             <w:pPr>
@@ -4567,7 +4774,7 @@
         </w:tc>
         <w:tc>
           <w:tcPr>
-            <w:tcW w:type="dxa" w:w="850"/>
+            <w:tcW w:type="dxa" w:w="794"/>
           </w:tcPr>
           <w:p>
             <w:pPr>
@@ -4584,7 +4791,7 @@
         </w:tc>
         <w:tc>
           <w:tcPr>
-            <w:tcW w:type="dxa" w:w="850"/>
+            <w:tcW w:type="dxa" w:w="794"/>
           </w:tcPr>
           <w:p>
             <w:pPr>
@@ -4601,7 +4808,7 @@
         </w:tc>
         <w:tc>
           <w:tcPr>
-            <w:tcW w:type="dxa" w:w="1247"/>
+            <w:tcW w:type="dxa" w:w="1417"/>
           </w:tcPr>
           <w:p>
             <w:pPr>
@@ -4618,7 +4825,7 @@
         </w:tc>
         <w:tc>
           <w:tcPr>
-            <w:tcW w:type="dxa" w:w="907"/>
+            <w:tcW w:type="dxa" w:w="850"/>
           </w:tcPr>
           <w:p>
             <w:pPr>
@@ -4655,7 +4862,7 @@
         </w:tc>
         <w:tc>
           <w:tcPr>
-            <w:tcW w:type="dxa" w:w="850"/>
+            <w:tcW w:type="dxa" w:w="794"/>
             <w:shd w:fill="EAF1F8"/>
           </w:tcPr>
           <w:p>
@@ -4673,7 +4880,7 @@
         </w:tc>
         <w:tc>
           <w:tcPr>
-            <w:tcW w:type="dxa" w:w="850"/>
+            <w:tcW w:type="dxa" w:w="794"/>
             <w:shd w:fill="EAF1F8"/>
           </w:tcPr>
           <w:p>
@@ -4691,7 +4898,7 @@
         </w:tc>
         <w:tc>
           <w:tcPr>
-            <w:tcW w:type="dxa" w:w="850"/>
+            <w:tcW w:type="dxa" w:w="794"/>
             <w:shd w:fill="EAF1F8"/>
           </w:tcPr>
           <w:p>
@@ -4709,7 +4916,7 @@
         </w:tc>
         <w:tc>
           <w:tcPr>
-            <w:tcW w:type="dxa" w:w="850"/>
+            <w:tcW w:type="dxa" w:w="794"/>
             <w:shd w:fill="EAF1F8"/>
           </w:tcPr>
           <w:p>
@@ -4727,7 +4934,7 @@
         </w:tc>
         <w:tc>
           <w:tcPr>
-            <w:tcW w:type="dxa" w:w="850"/>
+            <w:tcW w:type="dxa" w:w="794"/>
             <w:shd w:fill="EAF1F8"/>
           </w:tcPr>
           <w:p>
@@ -4745,7 +4952,7 @@
         </w:tc>
         <w:tc>
           <w:tcPr>
-            <w:tcW w:type="dxa" w:w="850"/>
+            <w:tcW w:type="dxa" w:w="794"/>
             <w:shd w:fill="EAF1F8"/>
           </w:tcPr>
           <w:p>
@@ -4763,7 +4970,7 @@
         </w:tc>
         <w:tc>
           <w:tcPr>
-            <w:tcW w:type="dxa" w:w="1247"/>
+            <w:tcW w:type="dxa" w:w="1417"/>
             <w:shd w:fill="EAF1F8"/>
           </w:tcPr>
           <w:p>
@@ -4781,7 +4988,7 @@
         </w:tc>
         <w:tc>
           <w:tcPr>
-            <w:tcW w:type="dxa" w:w="907"/>
+            <w:tcW w:type="dxa" w:w="850"/>
             <w:shd w:fill="EAF1F8"/>
           </w:tcPr>
           <w:p>
@@ -4818,7 +5025,7 @@
         </w:tc>
         <w:tc>
           <w:tcPr>
-            <w:tcW w:type="dxa" w:w="850"/>
+            <w:tcW w:type="dxa" w:w="794"/>
           </w:tcPr>
           <w:p>
             <w:pPr>
@@ -4835,7 +5042,7 @@
         </w:tc>
         <w:tc>
           <w:tcPr>
-            <w:tcW w:type="dxa" w:w="850"/>
+            <w:tcW w:type="dxa" w:w="794"/>
           </w:tcPr>
           <w:p>
             <w:pPr>
@@ -4852,7 +5059,7 @@
         </w:tc>
         <w:tc>
           <w:tcPr>
-            <w:tcW w:type="dxa" w:w="850"/>
+            <w:tcW w:type="dxa" w:w="794"/>
           </w:tcPr>
           <w:p>
             <w:pPr>
@@ -4869,7 +5076,7 @@
         </w:tc>
         <w:tc>
           <w:tcPr>
-            <w:tcW w:type="dxa" w:w="850"/>
+            <w:tcW w:type="dxa" w:w="794"/>
           </w:tcPr>
           <w:p>
             <w:pPr>
@@ -4886,7 +5093,7 @@
         </w:tc>
         <w:tc>
           <w:tcPr>
-            <w:tcW w:type="dxa" w:w="850"/>
+            <w:tcW w:type="dxa" w:w="794"/>
           </w:tcPr>
           <w:p>
             <w:pPr>
@@ -4903,7 +5110,7 @@
         </w:tc>
         <w:tc>
           <w:tcPr>
-            <w:tcW w:type="dxa" w:w="850"/>
+            <w:tcW w:type="dxa" w:w="794"/>
           </w:tcPr>
           <w:p>
             <w:pPr>
@@ -4920,7 +5127,7 @@
         </w:tc>
         <w:tc>
           <w:tcPr>
-            <w:tcW w:type="dxa" w:w="1247"/>
+            <w:tcW w:type="dxa" w:w="1417"/>
           </w:tcPr>
           <w:p>
             <w:pPr>
@@ -4937,7 +5144,7 @@
         </w:tc>
         <w:tc>
           <w:tcPr>
-            <w:tcW w:type="dxa" w:w="907"/>
+            <w:tcW w:type="dxa" w:w="850"/>
           </w:tcPr>
           <w:p>
             <w:pPr>
@@ -4974,7 +5181,7 @@
         </w:tc>
         <w:tc>
           <w:tcPr>
-            <w:tcW w:type="dxa" w:w="850"/>
+            <w:tcW w:type="dxa" w:w="794"/>
             <w:shd w:fill="EAF1F8"/>
           </w:tcPr>
           <w:p>
@@ -4992,7 +5199,7 @@
         </w:tc>
         <w:tc>
           <w:tcPr>
-            <w:tcW w:type="dxa" w:w="850"/>
+            <w:tcW w:type="dxa" w:w="794"/>
             <w:shd w:fill="EAF1F8"/>
           </w:tcPr>
           <w:p>
@@ -5010,7 +5217,7 @@
         </w:tc>
         <w:tc>
           <w:tcPr>
-            <w:tcW w:type="dxa" w:w="850"/>
+            <w:tcW w:type="dxa" w:w="794"/>
             <w:shd w:fill="EAF1F8"/>
           </w:tcPr>
           <w:p>
@@ -5028,7 +5235,7 @@
         </w:tc>
         <w:tc>
           <w:tcPr>
-            <w:tcW w:type="dxa" w:w="850"/>
+            <w:tcW w:type="dxa" w:w="794"/>
             <w:shd w:fill="EAF1F8"/>
           </w:tcPr>
           <w:p>
@@ -5046,7 +5253,7 @@
         </w:tc>
         <w:tc>
           <w:tcPr>
-            <w:tcW w:type="dxa" w:w="850"/>
+            <w:tcW w:type="dxa" w:w="794"/>
             <w:shd w:fill="EAF1F8"/>
           </w:tcPr>
           <w:p>
@@ -5064,7 +5271,7 @@
         </w:tc>
         <w:tc>
           <w:tcPr>
-            <w:tcW w:type="dxa" w:w="850"/>
+            <w:tcW w:type="dxa" w:w="794"/>
             <w:shd w:fill="EAF1F8"/>
           </w:tcPr>
           <w:p>
@@ -5082,7 +5289,7 @@
         </w:tc>
         <w:tc>
           <w:tcPr>
-            <w:tcW w:type="dxa" w:w="1247"/>
+            <w:tcW w:type="dxa" w:w="1417"/>
             <w:shd w:fill="EAF1F8"/>
           </w:tcPr>
           <w:p>
@@ -5100,7 +5307,7 @@
         </w:tc>
         <w:tc>
           <w:tcPr>
-            <w:tcW w:type="dxa" w:w="907"/>
+            <w:tcW w:type="dxa" w:w="850"/>
             <w:shd w:fill="EAF1F8"/>
           </w:tcPr>
           <w:p>
@@ -5137,7 +5344,7 @@
         </w:tc>
         <w:tc>
           <w:tcPr>
-            <w:tcW w:type="dxa" w:w="850"/>
+            <w:tcW w:type="dxa" w:w="794"/>
           </w:tcPr>
           <w:p>
             <w:pPr>
@@ -5154,7 +5361,7 @@
         </w:tc>
         <w:tc>
           <w:tcPr>
-            <w:tcW w:type="dxa" w:w="850"/>
+            <w:tcW w:type="dxa" w:w="794"/>
           </w:tcPr>
           <w:p>
             <w:pPr>
@@ -5171,7 +5378,7 @@
         </w:tc>
         <w:tc>
           <w:tcPr>
-            <w:tcW w:type="dxa" w:w="850"/>
+            <w:tcW w:type="dxa" w:w="794"/>
           </w:tcPr>
           <w:p>
             <w:pPr>
@@ -5188,7 +5395,7 @@
         </w:tc>
         <w:tc>
           <w:tcPr>
-            <w:tcW w:type="dxa" w:w="850"/>
+            <w:tcW w:type="dxa" w:w="794"/>
           </w:tcPr>
           <w:p>
             <w:pPr>
@@ -5205,7 +5412,7 @@
         </w:tc>
         <w:tc>
           <w:tcPr>
-            <w:tcW w:type="dxa" w:w="850"/>
+            <w:tcW w:type="dxa" w:w="794"/>
           </w:tcPr>
           <w:p>
             <w:pPr>
@@ -5222,7 +5429,7 @@
         </w:tc>
         <w:tc>
           <w:tcPr>
-            <w:tcW w:type="dxa" w:w="850"/>
+            <w:tcW w:type="dxa" w:w="794"/>
           </w:tcPr>
           <w:p>
             <w:pPr>
@@ -5239,7 +5446,7 @@
         </w:tc>
         <w:tc>
           <w:tcPr>
-            <w:tcW w:type="dxa" w:w="1247"/>
+            <w:tcW w:type="dxa" w:w="1417"/>
           </w:tcPr>
           <w:p>
             <w:pPr>
@@ -5256,7 +5463,7 @@
         </w:tc>
         <w:tc>
           <w:tcPr>
-            <w:tcW w:type="dxa" w:w="907"/>
+            <w:tcW w:type="dxa" w:w="850"/>
           </w:tcPr>
           <w:p>
             <w:pPr>
@@ -8382,47 +8589,145 @@
     </w:p>
     <w:p>
       <w:pPr>
+        <w:keepLines/>
         <w:spacing w:before="120" w:after="160" w:line="240" w:lineRule="auto"/>
-        <w:ind w:left="340"/>
+        <w:ind w:left="283" w:right="170"/>
+        <w:jc w:val="left"/>
         <w:shd w:fill="F2F2F2"/>
       </w:pPr>
       <w:r>
         <w:rPr>
-          <w:rFonts w:ascii="Consolas" w:hAnsi="Consolas" w:eastAsia="Consolas"/>
-          <w:sz w:val="17"/>
+          <w:rFonts w:ascii="Courier New" w:hAnsi="Courier New" w:eastAsia="Courier New" w:cs="Courier New"/>
+          <w:sz w:val="16"/>
         </w:rPr>
         <w:t>yahtzee-montecarlo/</w:t>
         <w:br/>
+      </w:r>
+      <w:r>
+        <w:rPr>
+          <w:rFonts w:ascii="Courier New" w:hAnsi="Courier New" w:eastAsia="Courier New" w:cs="Courier New"/>
+          <w:sz w:val="16"/>
+        </w:rPr>
         <w:t>├── main.py                   # menú interactivo y línea de comandos</w:t>
         <w:br/>
+      </w:r>
+      <w:r>
+        <w:rPr>
+          <w:rFonts w:ascii="Courier New" w:hAnsi="Courier New" w:eastAsia="Courier New" w:cs="Courier New"/>
+          <w:sz w:val="16"/>
+        </w:rPr>
         <w:t>├── src/yahtzee/              # paquete con la lógica del juego</w:t>
         <w:br/>
+      </w:r>
+      <w:r>
+        <w:rPr>
+          <w:rFonts w:ascii="Courier New" w:hAnsi="Courier New" w:eastAsia="Courier New" w:cs="Courier New"/>
+          <w:sz w:val="16"/>
+        </w:rPr>
         <w:t>│   ├── dados.py              # dados y tiradas</w:t>
         <w:br/>
+      </w:r>
+      <w:r>
+        <w:rPr>
+          <w:rFonts w:ascii="Courier New" w:hAnsi="Courier New" w:eastAsia="Courier New" w:cs="Courier New"/>
+          <w:sz w:val="16"/>
+        </w:rPr>
         <w:t>│   ├── puntuacion.py         # reglas de las 13 casillas</w:t>
         <w:br/>
+      </w:r>
+      <w:r>
+        <w:rPr>
+          <w:rFonts w:ascii="Courier New" w:hAnsi="Courier New" w:eastAsia="Courier New" w:cs="Courier New"/>
+          <w:sz w:val="16"/>
+        </w:rPr>
         <w:t>│   ├── tabla.py              # tabla de puntaje de un jugador</w:t>
         <w:br/>
+      </w:r>
+      <w:r>
+        <w:rPr>
+          <w:rFonts w:ascii="Courier New" w:hAnsi="Courier New" w:eastAsia="Courier New" w:cs="Courier New"/>
+          <w:sz w:val="16"/>
+        </w:rPr>
         <w:t>│   ├── estrategias.py        # estrategias aleatoria, heurística y manual</w:t>
         <w:br/>
+      </w:r>
+      <w:r>
+        <w:rPr>
+          <w:rFonts w:ascii="Courier New" w:hAnsi="Courier New" w:eastAsia="Courier New" w:cs="Courier New"/>
+          <w:sz w:val="16"/>
+        </w:rPr>
         <w:t>│   ├── juego.py              # turnos y partidas</w:t>
         <w:br/>
+      </w:r>
+      <w:r>
+        <w:rPr>
+          <w:rFonts w:ascii="Courier New" w:hAnsi="Courier New" w:eastAsia="Courier New" w:cs="Courier New"/>
+          <w:sz w:val="16"/>
+        </w:rPr>
         <w:t>│   ├── montecarlo.py         # experimentos y estadística</w:t>
         <w:br/>
+      </w:r>
+      <w:r>
+        <w:rPr>
+          <w:rFonts w:ascii="Courier New" w:hAnsi="Courier New" w:eastAsia="Courier New" w:cs="Courier New"/>
+          <w:sz w:val="16"/>
+        </w:rPr>
         <w:t>│   ├── graficas.py           # figuras con Pillow</w:t>
         <w:br/>
+      </w:r>
+      <w:r>
+        <w:rPr>
+          <w:rFonts w:ascii="Courier New" w:hAnsi="Courier New" w:eastAsia="Courier New" w:cs="Courier New"/>
+          <w:sz w:val="16"/>
+        </w:rPr>
         <w:t>│   └── consola.py            # entrada y salida por terminal</w:t>
         <w:br/>
+      </w:r>
+      <w:r>
+        <w:rPr>
+          <w:rFonts w:ascii="Courier New" w:hAnsi="Courier New" w:eastAsia="Courier New" w:cs="Courier New"/>
+          <w:sz w:val="16"/>
+        </w:rPr>
         <w:t>├── scripts/                  # ejecución de experimentos y resúmenes</w:t>
         <w:br/>
+      </w:r>
+      <w:r>
+        <w:rPr>
+          <w:rFonts w:ascii="Courier New" w:hAnsi="Courier New" w:eastAsia="Courier New" w:cs="Courier New"/>
+          <w:sz w:val="16"/>
+        </w:rPr>
         <w:t>├── tests/                    # 29 pruebas unitarias</w:t>
         <w:br/>
+      </w:r>
+      <w:r>
+        <w:rPr>
+          <w:rFonts w:ascii="Courier New" w:hAnsi="Courier New" w:eastAsia="Courier New" w:cs="Courier New"/>
+          <w:sz w:val="16"/>
+        </w:rPr>
         <w:t>├── docs/                     # guion del video y este generador</w:t>
         <w:br/>
+      </w:r>
+      <w:r>
+        <w:rPr>
+          <w:rFonts w:ascii="Courier New" w:hAnsi="Courier New" w:eastAsia="Courier New" w:cs="Courier New"/>
+          <w:sz w:val="16"/>
+        </w:rPr>
         <w:t>├── resultados/               # CSV, JSON y figuras generadas</w:t>
         <w:br/>
+      </w:r>
+      <w:r>
+        <w:rPr>
+          <w:rFonts w:ascii="Courier New" w:hAnsi="Courier New" w:eastAsia="Courier New" w:cs="Courier New"/>
+          <w:sz w:val="16"/>
+        </w:rPr>
         <w:t>├── requirements.txt</w:t>
         <w:br/>
+      </w:r>
+      <w:r>
+        <w:rPr>
+          <w:rFonts w:ascii="Courier New" w:hAnsi="Courier New" w:eastAsia="Courier New" w:cs="Courier New"/>
+          <w:sz w:val="16"/>
+        </w:rPr>
         <w:t>└── README.md</w:t>
       </w:r>
     </w:p>
@@ -8436,30 +8741,80 @@
     </w:p>
     <w:p>
       <w:pPr>
+        <w:keepLines/>
         <w:spacing w:before="120" w:after="160" w:line="240" w:lineRule="auto"/>
-        <w:ind w:left="340"/>
+        <w:ind w:left="283" w:right="170"/>
+        <w:jc w:val="left"/>
         <w:shd w:fill="F2F2F2"/>
       </w:pPr>
       <w:r>
         <w:rPr>
-          <w:rFonts w:ascii="Consolas" w:hAnsi="Consolas" w:eastAsia="Consolas"/>
-          <w:sz w:val="17"/>
+          <w:rFonts w:ascii="Courier New" w:hAnsi="Courier New" w:eastAsia="Courier New" w:cs="Courier New"/>
+          <w:sz w:val="16"/>
         </w:rPr>
         <w:t>git clone https://github.com/&lt;usuario&gt;/yahtzee-montecarlo.git</w:t>
         <w:br/>
+      </w:r>
+      <w:r>
+        <w:rPr>
+          <w:rFonts w:ascii="Courier New" w:hAnsi="Courier New" w:eastAsia="Courier New" w:cs="Courier New"/>
+          <w:sz w:val="16"/>
+        </w:rPr>
         <w:t>cd yahtzee-montecarlo</w:t>
         <w:br/>
+      </w:r>
+      <w:r>
+        <w:rPr>
+          <w:rFonts w:ascii="Courier New" w:hAnsi="Courier New" w:eastAsia="Courier New" w:cs="Courier New"/>
+          <w:sz w:val="16"/>
+        </w:rPr>
         <w:t>pip install -r requirements.txt</w:t>
         <w:br/>
+      </w:r>
+      <w:r>
+        <w:rPr>
+          <w:rFonts w:ascii="Courier New" w:hAnsi="Courier New" w:eastAsia="Courier New" w:cs="Courier New"/>
+          <w:sz w:val="16"/>
+        </w:rPr>
         <w:br/>
+      </w:r>
+      <w:r>
+        <w:rPr>
+          <w:rFonts w:ascii="Courier New" w:hAnsi="Courier New" w:eastAsia="Courier New" w:cs="Courier New"/>
+          <w:sz w:val="16"/>
+        </w:rPr>
         <w:t>python main.py                    # menú interactivo</w:t>
         <w:br/>
+      </w:r>
+      <w:r>
+        <w:rPr>
+          <w:rFonts w:ascii="Courier New" w:hAnsi="Courier New" w:eastAsia="Courier New" w:cs="Courier New"/>
+          <w:sz w:val="16"/>
+        </w:rPr>
         <w:t>python main.py jugar --contra-ia  # partida contra la IA</w:t>
         <w:br/>
+      </w:r>
+      <w:r>
+        <w:rPr>
+          <w:rFonts w:ascii="Courier New" w:hAnsi="Courier New" w:eastAsia="Courier New" w:cs="Courier New"/>
+          <w:sz w:val="16"/>
+        </w:rPr>
         <w:t>python main.py simular --n 10000  # Montecarlo con 10.000 partidas</w:t>
         <w:br/>
+      </w:r>
+      <w:r>
+        <w:rPr>
+          <w:rFonts w:ascii="Courier New" w:hAnsi="Courier New" w:eastAsia="Courier New" w:cs="Courier New"/>
+          <w:sz w:val="16"/>
+        </w:rPr>
         <w:t>python main.py experimentos       # experimentos completos + gráficas</w:t>
         <w:br/>
+      </w:r>
+      <w:r>
+        <w:rPr>
+          <w:rFonts w:ascii="Courier New" w:hAnsi="Courier New" w:eastAsia="Courier New" w:cs="Courier New"/>
+          <w:sz w:val="16"/>
+        </w:rPr>
         <w:t>python -m unittest discover -s tests -v   # pruebas</w:t>
       </w:r>
     </w:p>

</xml_diff>

<commit_message>
docs: elimina del indice la entrada de la seccion retirada
</commit_message>
<xml_diff>
--- a/Rios_JuanCamilo_Montecarlo.docx
+++ b/Rios_JuanCamilo_Montecarlo.docx
@@ -275,19 +275,6 @@
           <w:i w:val="0"/>
         </w:rPr>
         <w:t xml:space="preserve">6. Conclusiones</w:t>
-      </w:r>
-    </w:p>
-    <w:p>
-      <w:pPr>
-        <w:spacing w:after="40" w:line="240" w:lineRule="auto"/>
-        <w:jc w:val="left"/>
-      </w:pPr>
-      <w:r>
-        <w:rPr>
-          <w:b w:val="0"/>
-          <w:i w:val="0"/>
-        </w:rPr>
-        <w:t xml:space="preserve">7. Recomendaciones y trabajo futuro</w:t>
       </w:r>
     </w:p>
     <w:p>

</xml_diff>